<commit_message>
memisahkan css dari logic file, mengupdate/memperbaiki bug pada filedocumentParser.js
</commit_message>
<xml_diff>
--- a/Penjelasan Code.docx
+++ b/Penjelasan Code.docx
@@ -1104,131 +1104,38 @@
           <w:rFonts w:ascii="Times New Roman" w:hAnsi="Times New Roman" w:cs="Times New Roman"/>
           <w:sz w:val="24"/>
           <w:szCs w:val="24"/>
-          <w:lang w:val="en-ID"/>
-        </w:rPr>
-      </w:pPr>
-      <w:proofErr w:type="spellStart"/>
-      <w:r>
-        <w:rPr>
-          <w:rFonts w:ascii="Times New Roman" w:hAnsi="Times New Roman" w:cs="Times New Roman"/>
-          <w:sz w:val="24"/>
-          <w:szCs w:val="24"/>
-          <w:lang w:val="en-ID"/>
-        </w:rPr>
-        <w:t>const</w:t>
-      </w:r>
-      <w:proofErr w:type="spellEnd"/>
-      <w:r>
-        <w:rPr>
-          <w:rFonts w:ascii="Times New Roman" w:hAnsi="Times New Roman" w:cs="Times New Roman"/>
-          <w:sz w:val="24"/>
-          <w:szCs w:val="24"/>
-          <w:lang w:val="en-ID"/>
-        </w:rPr>
-        <w:t xml:space="preserve"> </w:t>
-      </w:r>
-      <w:proofErr w:type="spellStart"/>
-      <w:r>
-        <w:rPr>
-          <w:rFonts w:ascii="Times New Roman" w:hAnsi="Times New Roman" w:cs="Times New Roman"/>
-          <w:sz w:val="24"/>
-          <w:szCs w:val="24"/>
-          <w:lang w:val="en-ID"/>
-        </w:rPr>
-        <w:t>formData</w:t>
-      </w:r>
-      <w:proofErr w:type="spellEnd"/>
-      <w:r>
-        <w:rPr>
-          <w:rFonts w:ascii="Times New Roman" w:hAnsi="Times New Roman" w:cs="Times New Roman"/>
-          <w:sz w:val="24"/>
-          <w:szCs w:val="24"/>
-          <w:lang w:val="en-ID"/>
-        </w:rPr>
-        <w:t xml:space="preserve"> = new </w:t>
-      </w:r>
-      <w:proofErr w:type="spellStart"/>
-      <w:proofErr w:type="gramStart"/>
-      <w:r>
-        <w:rPr>
-          <w:rFonts w:ascii="Times New Roman" w:hAnsi="Times New Roman" w:cs="Times New Roman"/>
-          <w:sz w:val="24"/>
-          <w:szCs w:val="24"/>
-          <w:lang w:val="en-ID"/>
-        </w:rPr>
-        <w:t>FormData</w:t>
-      </w:r>
-      <w:proofErr w:type="spellEnd"/>
-      <w:r>
-        <w:rPr>
-          <w:rFonts w:ascii="Times New Roman" w:hAnsi="Times New Roman" w:cs="Times New Roman"/>
-          <w:sz w:val="24"/>
-          <w:szCs w:val="24"/>
-          <w:lang w:val="en-ID"/>
-        </w:rPr>
-        <w:t>(</w:t>
-      </w:r>
-      <w:proofErr w:type="gramEnd"/>
-      <w:r>
-        <w:rPr>
-          <w:rFonts w:ascii="Times New Roman" w:hAnsi="Times New Roman" w:cs="Times New Roman"/>
-          <w:sz w:val="24"/>
-          <w:szCs w:val="24"/>
-          <w:lang w:val="en-ID"/>
-        </w:rPr>
-        <w:t>);</w:t>
-      </w:r>
-    </w:p>
-    <w:p>
-      <w:pPr>
-        <w:spacing w:line="360" w:lineRule="auto"/>
-        <w:jc w:val="both"/>
-        <w:rPr>
-          <w:rFonts w:ascii="Times New Roman" w:hAnsi="Times New Roman" w:cs="Times New Roman"/>
-          <w:sz w:val="24"/>
-          <w:szCs w:val="24"/>
-          <w:lang w:val="en-ID"/>
-        </w:rPr>
-      </w:pPr>
-      <w:proofErr w:type="spellStart"/>
-      <w:r>
-        <w:rPr>
-          <w:rFonts w:ascii="Times New Roman" w:hAnsi="Times New Roman" w:cs="Times New Roman"/>
-          <w:sz w:val="24"/>
-          <w:szCs w:val="24"/>
-          <w:lang w:val="en-ID"/>
-        </w:rPr>
-        <w:t>formData.append</w:t>
-      </w:r>
-      <w:proofErr w:type="spellEnd"/>
-      <w:r>
-        <w:rPr>
-          <w:rFonts w:ascii="Times New Roman" w:hAnsi="Times New Roman" w:cs="Times New Roman"/>
-          <w:sz w:val="24"/>
-          <w:szCs w:val="24"/>
-          <w:lang w:val="en-ID"/>
-        </w:rPr>
-        <w:t>('</w:t>
-      </w:r>
-      <w:proofErr w:type="spellStart"/>
-      <w:r>
-        <w:rPr>
-          <w:rFonts w:ascii="Times New Roman" w:hAnsi="Times New Roman" w:cs="Times New Roman"/>
-          <w:sz w:val="24"/>
-          <w:szCs w:val="24"/>
-          <w:lang w:val="en-ID"/>
-        </w:rPr>
-        <w:t>materi</w:t>
-      </w:r>
-      <w:proofErr w:type="spellEnd"/>
-      <w:r>
-        <w:rPr>
-          <w:rFonts w:ascii="Times New Roman" w:hAnsi="Times New Roman" w:cs="Times New Roman"/>
-          <w:sz w:val="24"/>
-          <w:szCs w:val="24"/>
-          <w:lang w:val="en-ID"/>
-        </w:rPr>
-        <w:t xml:space="preserve">', file); </w:t>
+          <w:lang w:val="sv-SE"/>
+        </w:rPr>
+      </w:pPr>
+      <w:r>
+        <w:rPr>
+          <w:rFonts w:ascii="Times New Roman" w:hAnsi="Times New Roman" w:cs="Times New Roman"/>
+          <w:sz w:val="24"/>
+          <w:szCs w:val="24"/>
+          <w:lang w:val="sv-SE"/>
+        </w:rPr>
+        <w:t>const formData = new FormData();</w:t>
+      </w:r>
+    </w:p>
+    <w:p>
+      <w:pPr>
+        <w:spacing w:line="360" w:lineRule="auto"/>
+        <w:jc w:val="both"/>
+        <w:rPr>
+          <w:rFonts w:ascii="Times New Roman" w:hAnsi="Times New Roman" w:cs="Times New Roman"/>
+          <w:sz w:val="24"/>
+          <w:szCs w:val="24"/>
+          <w:lang w:val="sv-SE"/>
+        </w:rPr>
+      </w:pPr>
+      <w:r>
+        <w:rPr>
+          <w:rFonts w:ascii="Times New Roman" w:hAnsi="Times New Roman" w:cs="Times New Roman"/>
+          <w:sz w:val="24"/>
+          <w:szCs w:val="24"/>
+          <w:lang w:val="sv-SE"/>
+        </w:rPr>
+        <w:t xml:space="preserve">formData.append('materi', file); </w:t>
       </w:r>
     </w:p>
     <w:p>
@@ -2002,7 +1909,6 @@
         <w:t>if (</w:t>
       </w:r>
       <w:proofErr w:type="spellStart"/>
-      <w:proofErr w:type="gramStart"/>
       <w:r>
         <w:rPr>
           <w:rFonts w:ascii="Times New Roman" w:hAnsi="Times New Roman" w:cs="Times New Roman"/>
@@ -2013,7 +1919,6 @@
         <w:t>response.ok</w:t>
       </w:r>
       <w:proofErr w:type="spellEnd"/>
-      <w:proofErr w:type="gramEnd"/>
       <w:r>
         <w:rPr>
           <w:rFonts w:ascii="Times New Roman" w:hAnsi="Times New Roman" w:cs="Times New Roman"/>
@@ -2452,27 +2357,7 @@
           <w:szCs w:val="24"/>
           <w:lang w:val="en-ID"/>
         </w:rPr>
-        <w:t xml:space="preserve"> app = </w:t>
-      </w:r>
-      <w:proofErr w:type="gramStart"/>
-      <w:r>
-        <w:rPr>
-          <w:rFonts w:ascii="Times New Roman" w:hAnsi="Times New Roman" w:cs="Times New Roman"/>
-          <w:sz w:val="24"/>
-          <w:szCs w:val="24"/>
-          <w:lang w:val="en-ID"/>
-        </w:rPr>
-        <w:t>express(</w:t>
-      </w:r>
-      <w:proofErr w:type="gramEnd"/>
-      <w:r>
-        <w:rPr>
-          <w:rFonts w:ascii="Times New Roman" w:hAnsi="Times New Roman" w:cs="Times New Roman"/>
-          <w:sz w:val="24"/>
-          <w:szCs w:val="24"/>
-          <w:lang w:val="en-ID"/>
-        </w:rPr>
-        <w:t>);</w:t>
+        <w:t xml:space="preserve"> app = express();</w:t>
       </w:r>
     </w:p>
     <w:p>
@@ -2507,7 +2392,6 @@
         <w:t>(</w:t>
       </w:r>
       <w:proofErr w:type="spellStart"/>
-      <w:proofErr w:type="gramStart"/>
       <w:r>
         <w:rPr>
           <w:rFonts w:ascii="Times New Roman" w:hAnsi="Times New Roman" w:cs="Times New Roman"/>
@@ -2525,17 +2409,7 @@
           <w:szCs w:val="24"/>
           <w:lang w:val="en-ID"/>
         </w:rPr>
-        <w:t>(</w:t>
-      </w:r>
-      <w:proofErr w:type="gramEnd"/>
-      <w:r>
-        <w:rPr>
-          <w:rFonts w:ascii="Times New Roman" w:hAnsi="Times New Roman" w:cs="Times New Roman"/>
-          <w:sz w:val="24"/>
-          <w:szCs w:val="24"/>
-          <w:lang w:val="en-ID"/>
-        </w:rPr>
-        <w:t>));</w:t>
+        <w:t>());</w:t>
       </w:r>
     </w:p>
     <w:p>
@@ -2788,7 +2662,6 @@
         <w:t xml:space="preserve"> storage = </w:t>
       </w:r>
       <w:proofErr w:type="spellStart"/>
-      <w:proofErr w:type="gramStart"/>
       <w:r>
         <w:rPr>
           <w:rFonts w:ascii="Times New Roman" w:hAnsi="Times New Roman" w:cs="Times New Roman"/>
@@ -2799,7 +2672,6 @@
         <w:t>multer.diskStorage</w:t>
       </w:r>
       <w:proofErr w:type="spellEnd"/>
-      <w:proofErr w:type="gramEnd"/>
       <w:r>
         <w:rPr>
           <w:rFonts w:ascii="Times New Roman" w:hAnsi="Times New Roman" w:cs="Times New Roman"/>
@@ -2892,7 +2764,6 @@
         <w:t xml:space="preserve">    </w:t>
       </w:r>
       <w:proofErr w:type="spellStart"/>
-      <w:proofErr w:type="gramStart"/>
       <w:r>
         <w:rPr>
           <w:rFonts w:ascii="Times New Roman" w:hAnsi="Times New Roman" w:cs="Times New Roman"/>
@@ -2910,79 +2781,231 @@
           <w:szCs w:val="24"/>
           <w:lang w:val="en-ID"/>
         </w:rPr>
+        <w:t xml:space="preserve">(null, 'uploads/'); </w:t>
+      </w:r>
+    </w:p>
+    <w:p>
+      <w:pPr>
+        <w:spacing w:line="360" w:lineRule="auto"/>
+        <w:jc w:val="both"/>
+        <w:rPr>
+          <w:rFonts w:ascii="Times New Roman" w:hAnsi="Times New Roman" w:cs="Times New Roman"/>
+          <w:sz w:val="24"/>
+          <w:szCs w:val="24"/>
+          <w:lang w:val="en-ID"/>
+        </w:rPr>
+      </w:pPr>
+      <w:r>
+        <w:rPr>
+          <w:rFonts w:ascii="Times New Roman" w:hAnsi="Times New Roman" w:cs="Times New Roman"/>
+          <w:sz w:val="24"/>
+          <w:szCs w:val="24"/>
+          <w:lang w:val="en-ID"/>
+        </w:rPr>
+        <w:t xml:space="preserve">  },</w:t>
+      </w:r>
+    </w:p>
+    <w:p>
+      <w:pPr>
+        <w:spacing w:line="360" w:lineRule="auto"/>
+        <w:jc w:val="both"/>
+        <w:rPr>
+          <w:rFonts w:ascii="Times New Roman" w:hAnsi="Times New Roman" w:cs="Times New Roman"/>
+          <w:sz w:val="24"/>
+          <w:szCs w:val="24"/>
+          <w:lang w:val="en-ID"/>
+        </w:rPr>
+      </w:pPr>
+      <w:r>
+        <w:rPr>
+          <w:rFonts w:ascii="Times New Roman" w:hAnsi="Times New Roman" w:cs="Times New Roman"/>
+          <w:sz w:val="24"/>
+          <w:szCs w:val="24"/>
+          <w:lang w:val="en-ID"/>
+        </w:rPr>
+        <w:t xml:space="preserve">  filename: function (</w:t>
+      </w:r>
+      <w:proofErr w:type="spellStart"/>
+      <w:r>
+        <w:rPr>
+          <w:rFonts w:ascii="Times New Roman" w:hAnsi="Times New Roman" w:cs="Times New Roman"/>
+          <w:sz w:val="24"/>
+          <w:szCs w:val="24"/>
+          <w:lang w:val="en-ID"/>
+        </w:rPr>
+        <w:t>req</w:t>
+      </w:r>
+      <w:proofErr w:type="spellEnd"/>
+      <w:r>
+        <w:rPr>
+          <w:rFonts w:ascii="Times New Roman" w:hAnsi="Times New Roman" w:cs="Times New Roman"/>
+          <w:sz w:val="24"/>
+          <w:szCs w:val="24"/>
+          <w:lang w:val="en-ID"/>
+        </w:rPr>
+        <w:t xml:space="preserve">, file, </w:t>
+      </w:r>
+      <w:proofErr w:type="spellStart"/>
+      <w:r>
+        <w:rPr>
+          <w:rFonts w:ascii="Times New Roman" w:hAnsi="Times New Roman" w:cs="Times New Roman"/>
+          <w:sz w:val="24"/>
+          <w:szCs w:val="24"/>
+          <w:lang w:val="en-ID"/>
+        </w:rPr>
+        <w:t>cb</w:t>
+      </w:r>
+      <w:proofErr w:type="spellEnd"/>
+      <w:r>
+        <w:rPr>
+          <w:rFonts w:ascii="Times New Roman" w:hAnsi="Times New Roman" w:cs="Times New Roman"/>
+          <w:sz w:val="24"/>
+          <w:szCs w:val="24"/>
+          <w:lang w:val="en-ID"/>
+        </w:rPr>
+        <w:t>) {</w:t>
+      </w:r>
+    </w:p>
+    <w:p>
+      <w:pPr>
+        <w:spacing w:line="360" w:lineRule="auto"/>
+        <w:jc w:val="both"/>
+        <w:rPr>
+          <w:rFonts w:ascii="Times New Roman" w:hAnsi="Times New Roman" w:cs="Times New Roman"/>
+          <w:sz w:val="24"/>
+          <w:szCs w:val="24"/>
+          <w:lang w:val="en-ID"/>
+        </w:rPr>
+      </w:pPr>
+      <w:r>
+        <w:rPr>
+          <w:rFonts w:ascii="Times New Roman" w:hAnsi="Times New Roman" w:cs="Times New Roman"/>
+          <w:sz w:val="24"/>
+          <w:szCs w:val="24"/>
+          <w:lang w:val="en-ID"/>
+        </w:rPr>
+        <w:t xml:space="preserve">    </w:t>
+      </w:r>
+      <w:proofErr w:type="spellStart"/>
+      <w:r>
+        <w:rPr>
+          <w:rFonts w:ascii="Times New Roman" w:hAnsi="Times New Roman" w:cs="Times New Roman"/>
+          <w:sz w:val="24"/>
+          <w:szCs w:val="24"/>
+          <w:lang w:val="en-ID"/>
+        </w:rPr>
+        <w:t>const</w:t>
+      </w:r>
+      <w:proofErr w:type="spellEnd"/>
+      <w:r>
+        <w:rPr>
+          <w:rFonts w:ascii="Times New Roman" w:hAnsi="Times New Roman" w:cs="Times New Roman"/>
+          <w:sz w:val="24"/>
+          <w:szCs w:val="24"/>
+          <w:lang w:val="en-ID"/>
+        </w:rPr>
+        <w:t xml:space="preserve"> </w:t>
+      </w:r>
+      <w:proofErr w:type="spellStart"/>
+      <w:r>
+        <w:rPr>
+          <w:rFonts w:ascii="Times New Roman" w:hAnsi="Times New Roman" w:cs="Times New Roman"/>
+          <w:sz w:val="24"/>
+          <w:szCs w:val="24"/>
+          <w:lang w:val="en-ID"/>
+        </w:rPr>
+        <w:t>uniqueSuffix</w:t>
+      </w:r>
+      <w:proofErr w:type="spellEnd"/>
+      <w:r>
+        <w:rPr>
+          <w:rFonts w:ascii="Times New Roman" w:hAnsi="Times New Roman" w:cs="Times New Roman"/>
+          <w:sz w:val="24"/>
+          <w:szCs w:val="24"/>
+          <w:lang w:val="en-ID"/>
+        </w:rPr>
+        <w:t xml:space="preserve"> = </w:t>
+      </w:r>
+      <w:proofErr w:type="spellStart"/>
+      <w:r>
+        <w:rPr>
+          <w:rFonts w:ascii="Times New Roman" w:hAnsi="Times New Roman" w:cs="Times New Roman"/>
+          <w:sz w:val="24"/>
+          <w:szCs w:val="24"/>
+          <w:lang w:val="en-ID"/>
+        </w:rPr>
+        <w:t>Date.now</w:t>
+      </w:r>
+      <w:proofErr w:type="spellEnd"/>
+      <w:r>
+        <w:rPr>
+          <w:rFonts w:ascii="Times New Roman" w:hAnsi="Times New Roman" w:cs="Times New Roman"/>
+          <w:sz w:val="24"/>
+          <w:szCs w:val="24"/>
+          <w:lang w:val="en-ID"/>
+        </w:rPr>
+        <w:t xml:space="preserve">() + '-' + </w:t>
+      </w:r>
+      <w:proofErr w:type="spellStart"/>
+      <w:r>
+        <w:rPr>
+          <w:rFonts w:ascii="Times New Roman" w:hAnsi="Times New Roman" w:cs="Times New Roman"/>
+          <w:sz w:val="24"/>
+          <w:szCs w:val="24"/>
+          <w:lang w:val="en-ID"/>
+        </w:rPr>
+        <w:t>Math.round</w:t>
+      </w:r>
+      <w:proofErr w:type="spellEnd"/>
+      <w:r>
+        <w:rPr>
+          <w:rFonts w:ascii="Times New Roman" w:hAnsi="Times New Roman" w:cs="Times New Roman"/>
+          <w:sz w:val="24"/>
+          <w:szCs w:val="24"/>
+          <w:lang w:val="en-ID"/>
+        </w:rPr>
         <w:t>(</w:t>
       </w:r>
-      <w:proofErr w:type="gramEnd"/>
-      <w:r>
-        <w:rPr>
-          <w:rFonts w:ascii="Times New Roman" w:hAnsi="Times New Roman" w:cs="Times New Roman"/>
-          <w:sz w:val="24"/>
-          <w:szCs w:val="24"/>
-          <w:lang w:val="en-ID"/>
-        </w:rPr>
-        <w:t xml:space="preserve">null, 'uploads/'); </w:t>
-      </w:r>
-    </w:p>
-    <w:p>
-      <w:pPr>
-        <w:spacing w:line="360" w:lineRule="auto"/>
-        <w:jc w:val="both"/>
-        <w:rPr>
-          <w:rFonts w:ascii="Times New Roman" w:hAnsi="Times New Roman" w:cs="Times New Roman"/>
-          <w:sz w:val="24"/>
-          <w:szCs w:val="24"/>
-          <w:lang w:val="en-ID"/>
-        </w:rPr>
-      </w:pPr>
-      <w:r>
-        <w:rPr>
-          <w:rFonts w:ascii="Times New Roman" w:hAnsi="Times New Roman" w:cs="Times New Roman"/>
-          <w:sz w:val="24"/>
-          <w:szCs w:val="24"/>
-          <w:lang w:val="en-ID"/>
-        </w:rPr>
-        <w:t xml:space="preserve">  },</w:t>
-      </w:r>
-    </w:p>
-    <w:p>
-      <w:pPr>
-        <w:spacing w:line="360" w:lineRule="auto"/>
-        <w:jc w:val="both"/>
-        <w:rPr>
-          <w:rFonts w:ascii="Times New Roman" w:hAnsi="Times New Roman" w:cs="Times New Roman"/>
-          <w:sz w:val="24"/>
-          <w:szCs w:val="24"/>
-          <w:lang w:val="en-ID"/>
-        </w:rPr>
-      </w:pPr>
-      <w:r>
-        <w:rPr>
-          <w:rFonts w:ascii="Times New Roman" w:hAnsi="Times New Roman" w:cs="Times New Roman"/>
-          <w:sz w:val="24"/>
-          <w:szCs w:val="24"/>
-          <w:lang w:val="en-ID"/>
-        </w:rPr>
-        <w:t xml:space="preserve">  filename: function (</w:t>
-      </w:r>
-      <w:proofErr w:type="spellStart"/>
-      <w:r>
-        <w:rPr>
-          <w:rFonts w:ascii="Times New Roman" w:hAnsi="Times New Roman" w:cs="Times New Roman"/>
-          <w:sz w:val="24"/>
-          <w:szCs w:val="24"/>
-          <w:lang w:val="en-ID"/>
-        </w:rPr>
-        <w:t>req</w:t>
-      </w:r>
-      <w:proofErr w:type="spellEnd"/>
-      <w:r>
-        <w:rPr>
-          <w:rFonts w:ascii="Times New Roman" w:hAnsi="Times New Roman" w:cs="Times New Roman"/>
-          <w:sz w:val="24"/>
-          <w:szCs w:val="24"/>
-          <w:lang w:val="en-ID"/>
-        </w:rPr>
-        <w:t xml:space="preserve">, file, </w:t>
+      <w:proofErr w:type="spellStart"/>
+      <w:r>
+        <w:rPr>
+          <w:rFonts w:ascii="Times New Roman" w:hAnsi="Times New Roman" w:cs="Times New Roman"/>
+          <w:sz w:val="24"/>
+          <w:szCs w:val="24"/>
+          <w:lang w:val="en-ID"/>
+        </w:rPr>
+        <w:t>Math.random</w:t>
+      </w:r>
+      <w:proofErr w:type="spellEnd"/>
+      <w:r>
+        <w:rPr>
+          <w:rFonts w:ascii="Times New Roman" w:hAnsi="Times New Roman" w:cs="Times New Roman"/>
+          <w:sz w:val="24"/>
+          <w:szCs w:val="24"/>
+          <w:lang w:val="en-ID"/>
+        </w:rPr>
+        <w:t>() * 1E9);</w:t>
+      </w:r>
+    </w:p>
+    <w:p>
+      <w:pPr>
+        <w:spacing w:line="360" w:lineRule="auto"/>
+        <w:jc w:val="both"/>
+        <w:rPr>
+          <w:rFonts w:ascii="Times New Roman" w:hAnsi="Times New Roman" w:cs="Times New Roman"/>
+          <w:sz w:val="24"/>
+          <w:szCs w:val="24"/>
+          <w:lang w:val="en-ID"/>
+        </w:rPr>
+      </w:pPr>
+      <w:r>
+        <w:rPr>
+          <w:rFonts w:ascii="Times New Roman" w:hAnsi="Times New Roman" w:cs="Times New Roman"/>
+          <w:sz w:val="24"/>
+          <w:szCs w:val="24"/>
+          <w:lang w:val="en-ID"/>
+        </w:rPr>
+        <w:t xml:space="preserve">    </w:t>
       </w:r>
       <w:proofErr w:type="spellStart"/>
       <w:r>
@@ -3002,48 +3025,7 @@
           <w:szCs w:val="24"/>
           <w:lang w:val="en-ID"/>
         </w:rPr>
-        <w:t>) {</w:t>
-      </w:r>
-    </w:p>
-    <w:p>
-      <w:pPr>
-        <w:spacing w:line="360" w:lineRule="auto"/>
-        <w:jc w:val="both"/>
-        <w:rPr>
-          <w:rFonts w:ascii="Times New Roman" w:hAnsi="Times New Roman" w:cs="Times New Roman"/>
-          <w:sz w:val="24"/>
-          <w:szCs w:val="24"/>
-          <w:lang w:val="en-ID"/>
-        </w:rPr>
-      </w:pPr>
-      <w:r>
-        <w:rPr>
-          <w:rFonts w:ascii="Times New Roman" w:hAnsi="Times New Roman" w:cs="Times New Roman"/>
-          <w:sz w:val="24"/>
-          <w:szCs w:val="24"/>
-          <w:lang w:val="en-ID"/>
-        </w:rPr>
-        <w:t xml:space="preserve">    </w:t>
-      </w:r>
-      <w:proofErr w:type="spellStart"/>
-      <w:r>
-        <w:rPr>
-          <w:rFonts w:ascii="Times New Roman" w:hAnsi="Times New Roman" w:cs="Times New Roman"/>
-          <w:sz w:val="24"/>
-          <w:szCs w:val="24"/>
-          <w:lang w:val="en-ID"/>
-        </w:rPr>
-        <w:t>const</w:t>
-      </w:r>
-      <w:proofErr w:type="spellEnd"/>
-      <w:r>
-        <w:rPr>
-          <w:rFonts w:ascii="Times New Roman" w:hAnsi="Times New Roman" w:cs="Times New Roman"/>
-          <w:sz w:val="24"/>
-          <w:szCs w:val="24"/>
-          <w:lang w:val="en-ID"/>
-        </w:rPr>
-        <w:t xml:space="preserve"> </w:t>
+        <w:t xml:space="preserve">(null, </w:t>
       </w:r>
       <w:proofErr w:type="spellStart"/>
       <w:r>
@@ -3063,153 +3045,9 @@
           <w:szCs w:val="24"/>
           <w:lang w:val="en-ID"/>
         </w:rPr>
-        <w:t xml:space="preserve"> = </w:t>
-      </w:r>
-      <w:proofErr w:type="spellStart"/>
-      <w:proofErr w:type="gramStart"/>
-      <w:r>
-        <w:rPr>
-          <w:rFonts w:ascii="Times New Roman" w:hAnsi="Times New Roman" w:cs="Times New Roman"/>
-          <w:sz w:val="24"/>
-          <w:szCs w:val="24"/>
-          <w:lang w:val="en-ID"/>
-        </w:rPr>
-        <w:t>Date.now</w:t>
-      </w:r>
-      <w:proofErr w:type="spellEnd"/>
-      <w:r>
-        <w:rPr>
-          <w:rFonts w:ascii="Times New Roman" w:hAnsi="Times New Roman" w:cs="Times New Roman"/>
-          <w:sz w:val="24"/>
-          <w:szCs w:val="24"/>
-          <w:lang w:val="en-ID"/>
-        </w:rPr>
-        <w:t>(</w:t>
-      </w:r>
-      <w:proofErr w:type="gramEnd"/>
-      <w:r>
-        <w:rPr>
-          <w:rFonts w:ascii="Times New Roman" w:hAnsi="Times New Roman" w:cs="Times New Roman"/>
-          <w:sz w:val="24"/>
-          <w:szCs w:val="24"/>
-          <w:lang w:val="en-ID"/>
-        </w:rPr>
-        <w:t xml:space="preserve">) + '-' + </w:t>
-      </w:r>
-      <w:proofErr w:type="spellStart"/>
-      <w:r>
-        <w:rPr>
-          <w:rFonts w:ascii="Times New Roman" w:hAnsi="Times New Roman" w:cs="Times New Roman"/>
-          <w:sz w:val="24"/>
-          <w:szCs w:val="24"/>
-          <w:lang w:val="en-ID"/>
-        </w:rPr>
-        <w:t>Math.round</w:t>
-      </w:r>
-      <w:proofErr w:type="spellEnd"/>
-      <w:r>
-        <w:rPr>
-          <w:rFonts w:ascii="Times New Roman" w:hAnsi="Times New Roman" w:cs="Times New Roman"/>
-          <w:sz w:val="24"/>
-          <w:szCs w:val="24"/>
-          <w:lang w:val="en-ID"/>
-        </w:rPr>
-        <w:t>(</w:t>
-      </w:r>
-      <w:proofErr w:type="spellStart"/>
-      <w:r>
-        <w:rPr>
-          <w:rFonts w:ascii="Times New Roman" w:hAnsi="Times New Roman" w:cs="Times New Roman"/>
-          <w:sz w:val="24"/>
-          <w:szCs w:val="24"/>
-          <w:lang w:val="en-ID"/>
-        </w:rPr>
-        <w:t>Math.random</w:t>
-      </w:r>
-      <w:proofErr w:type="spellEnd"/>
-      <w:r>
-        <w:rPr>
-          <w:rFonts w:ascii="Times New Roman" w:hAnsi="Times New Roman" w:cs="Times New Roman"/>
-          <w:sz w:val="24"/>
-          <w:szCs w:val="24"/>
-          <w:lang w:val="en-ID"/>
-        </w:rPr>
-        <w:t>() * 1E9);</w:t>
-      </w:r>
-    </w:p>
-    <w:p>
-      <w:pPr>
-        <w:spacing w:line="360" w:lineRule="auto"/>
-        <w:jc w:val="both"/>
-        <w:rPr>
-          <w:rFonts w:ascii="Times New Roman" w:hAnsi="Times New Roman" w:cs="Times New Roman"/>
-          <w:sz w:val="24"/>
-          <w:szCs w:val="24"/>
-          <w:lang w:val="en-ID"/>
-        </w:rPr>
-      </w:pPr>
-      <w:r>
-        <w:rPr>
-          <w:rFonts w:ascii="Times New Roman" w:hAnsi="Times New Roman" w:cs="Times New Roman"/>
-          <w:sz w:val="24"/>
-          <w:szCs w:val="24"/>
-          <w:lang w:val="en-ID"/>
-        </w:rPr>
-        <w:t xml:space="preserve">    </w:t>
-      </w:r>
-      <w:proofErr w:type="spellStart"/>
-      <w:proofErr w:type="gramStart"/>
-      <w:r>
-        <w:rPr>
-          <w:rFonts w:ascii="Times New Roman" w:hAnsi="Times New Roman" w:cs="Times New Roman"/>
-          <w:sz w:val="24"/>
-          <w:szCs w:val="24"/>
-          <w:lang w:val="en-ID"/>
-        </w:rPr>
-        <w:t>cb</w:t>
-      </w:r>
-      <w:proofErr w:type="spellEnd"/>
-      <w:r>
-        <w:rPr>
-          <w:rFonts w:ascii="Times New Roman" w:hAnsi="Times New Roman" w:cs="Times New Roman"/>
-          <w:sz w:val="24"/>
-          <w:szCs w:val="24"/>
-          <w:lang w:val="en-ID"/>
-        </w:rPr>
-        <w:t>(</w:t>
-      </w:r>
-      <w:proofErr w:type="gramEnd"/>
-      <w:r>
-        <w:rPr>
-          <w:rFonts w:ascii="Times New Roman" w:hAnsi="Times New Roman" w:cs="Times New Roman"/>
-          <w:sz w:val="24"/>
-          <w:szCs w:val="24"/>
-          <w:lang w:val="en-ID"/>
-        </w:rPr>
-        <w:t xml:space="preserve">null, </w:t>
-      </w:r>
-      <w:proofErr w:type="spellStart"/>
-      <w:r>
-        <w:rPr>
-          <w:rFonts w:ascii="Times New Roman" w:hAnsi="Times New Roman" w:cs="Times New Roman"/>
-          <w:sz w:val="24"/>
-          <w:szCs w:val="24"/>
-          <w:lang w:val="en-ID"/>
-        </w:rPr>
-        <w:t>uniqueSuffix</w:t>
-      </w:r>
-      <w:proofErr w:type="spellEnd"/>
-      <w:r>
-        <w:rPr>
-          <w:rFonts w:ascii="Times New Roman" w:hAnsi="Times New Roman" w:cs="Times New Roman"/>
-          <w:sz w:val="24"/>
-          <w:szCs w:val="24"/>
-          <w:lang w:val="en-ID"/>
-        </w:rPr>
         <w:t xml:space="preserve"> + '-' + </w:t>
       </w:r>
       <w:proofErr w:type="spellStart"/>
-      <w:proofErr w:type="gramStart"/>
       <w:r>
         <w:rPr>
           <w:rFonts w:ascii="Times New Roman" w:hAnsi="Times New Roman" w:cs="Times New Roman"/>
@@ -3220,7 +3058,6 @@
         <w:t>file.originalname</w:t>
       </w:r>
       <w:proofErr w:type="spellEnd"/>
-      <w:proofErr w:type="gramEnd"/>
       <w:r>
         <w:rPr>
           <w:rFonts w:ascii="Times New Roman" w:hAnsi="Times New Roman" w:cs="Times New Roman"/>
@@ -3427,7 +3264,6 @@
         </w:rPr>
       </w:pPr>
       <w:proofErr w:type="spellStart"/>
-      <w:proofErr w:type="gramStart"/>
       <w:r>
         <w:rPr>
           <w:rFonts w:ascii="Times New Roman" w:hAnsi="Times New Roman" w:cs="Times New Roman"/>
@@ -3445,20 +3281,9 @@
           <w:szCs w:val="24"/>
           <w:lang w:val="en-ID"/>
         </w:rPr>
-        <w:t>(</w:t>
-      </w:r>
-      <w:proofErr w:type="gramEnd"/>
-      <w:r>
-        <w:rPr>
-          <w:rFonts w:ascii="Times New Roman" w:hAnsi="Times New Roman" w:cs="Times New Roman"/>
-          <w:sz w:val="24"/>
-          <w:szCs w:val="24"/>
-          <w:lang w:val="en-ID"/>
-        </w:rPr>
-        <w:t xml:space="preserve">'/', </w:t>
-      </w:r>
-      <w:proofErr w:type="spellStart"/>
-      <w:proofErr w:type="gramStart"/>
+        <w:t xml:space="preserve">('/', </w:t>
+      </w:r>
+      <w:proofErr w:type="spellStart"/>
       <w:r>
         <w:rPr>
           <w:rFonts w:ascii="Times New Roman" w:hAnsi="Times New Roman" w:cs="Times New Roman"/>
@@ -3469,7 +3294,6 @@
         <w:t>upload.single</w:t>
       </w:r>
       <w:proofErr w:type="spellEnd"/>
-      <w:proofErr w:type="gramEnd"/>
       <w:r>
         <w:rPr>
           <w:rFonts w:ascii="Times New Roman" w:hAnsi="Times New Roman" w:cs="Times New Roman"/>
@@ -3601,6 +3425,1076 @@
           <w:sz w:val="24"/>
           <w:szCs w:val="24"/>
           <w:lang w:val="sv-SE"/>
+        </w:rPr>
+      </w:pPr>
+    </w:p>
+    <w:p>
+      <w:pPr>
+        <w:spacing w:line="360" w:lineRule="auto"/>
+        <w:jc w:val="both"/>
+        <w:rPr>
+          <w:rFonts w:ascii="Times New Roman" w:hAnsi="Times New Roman" w:cs="Times New Roman"/>
+          <w:sz w:val="24"/>
+          <w:szCs w:val="24"/>
+          <w:lang w:val="sv-SE"/>
+        </w:rPr>
+      </w:pPr>
+      <w:r>
+        <w:rPr>
+          <w:rFonts w:ascii="Times New Roman" w:hAnsi="Times New Roman" w:cs="Times New Roman"/>
+          <w:sz w:val="24"/>
+          <w:szCs w:val="24"/>
+          <w:lang w:val="sv-SE"/>
+        </w:rPr>
+        <w:t>1. Bagian Backend: Tukang Baca Dokumen (documentParser.js)</w:t>
+      </w:r>
+    </w:p>
+    <w:p>
+      <w:pPr>
+        <w:spacing w:line="360" w:lineRule="auto"/>
+        <w:jc w:val="both"/>
+        <w:rPr>
+          <w:rFonts w:ascii="Times New Roman" w:hAnsi="Times New Roman" w:cs="Times New Roman"/>
+          <w:sz w:val="24"/>
+          <w:szCs w:val="24"/>
+          <w:lang w:val="sv-SE"/>
+        </w:rPr>
+      </w:pPr>
+      <w:r>
+        <w:rPr>
+          <w:rFonts w:ascii="Times New Roman" w:hAnsi="Times New Roman" w:cs="Times New Roman"/>
+          <w:sz w:val="24"/>
+          <w:szCs w:val="24"/>
+          <w:lang w:val="sv-SE"/>
+        </w:rPr>
+        <w:t>Ini adalah "mesin" di belakang layar yang tugasnya ngebongkar isi dokumenmu jadi teks mentah biar bisa dikasih ke AI.</w:t>
+      </w:r>
+    </w:p>
+    <w:p>
+      <w:pPr>
+        <w:spacing w:line="360" w:lineRule="auto"/>
+        <w:jc w:val="both"/>
+        <w:rPr>
+          <w:rFonts w:ascii="Times New Roman" w:hAnsi="Times New Roman" w:cs="Times New Roman"/>
+          <w:sz w:val="24"/>
+          <w:szCs w:val="24"/>
+          <w:lang w:val="sv-SE"/>
+        </w:rPr>
+      </w:pPr>
+    </w:p>
+    <w:p>
+      <w:pPr>
+        <w:spacing w:line="360" w:lineRule="auto"/>
+        <w:jc w:val="both"/>
+        <w:rPr>
+          <w:rFonts w:ascii="Times New Roman" w:hAnsi="Times New Roman" w:cs="Times New Roman"/>
+          <w:sz w:val="24"/>
+          <w:szCs w:val="24"/>
+          <w:lang w:val="en-ID"/>
+        </w:rPr>
+      </w:pPr>
+      <w:r>
+        <w:rPr>
+          <w:rFonts w:ascii="Times New Roman" w:hAnsi="Times New Roman" w:cs="Times New Roman"/>
+          <w:sz w:val="24"/>
+          <w:szCs w:val="24"/>
+          <w:lang w:val="en-ID"/>
+        </w:rPr>
+        <w:t xml:space="preserve">Trik </w:t>
+      </w:r>
+      <w:proofErr w:type="spellStart"/>
+      <w:r>
+        <w:rPr>
+          <w:rFonts w:ascii="Times New Roman" w:hAnsi="Times New Roman" w:cs="Times New Roman"/>
+          <w:sz w:val="24"/>
+          <w:szCs w:val="24"/>
+          <w:lang w:val="en-ID"/>
+        </w:rPr>
+        <w:t>Ngakalin</w:t>
+      </w:r>
+      <w:proofErr w:type="spellEnd"/>
+      <w:r>
+        <w:rPr>
+          <w:rFonts w:ascii="Times New Roman" w:hAnsi="Times New Roman" w:cs="Times New Roman"/>
+          <w:sz w:val="24"/>
+          <w:szCs w:val="24"/>
+          <w:lang w:val="en-ID"/>
+        </w:rPr>
+        <w:t xml:space="preserve"> Error Library (</w:t>
+      </w:r>
+      <w:proofErr w:type="spellStart"/>
+      <w:r>
+        <w:rPr>
+          <w:rFonts w:ascii="Times New Roman" w:hAnsi="Times New Roman" w:cs="Times New Roman"/>
+          <w:sz w:val="24"/>
+          <w:szCs w:val="24"/>
+          <w:lang w:val="en-ID"/>
+        </w:rPr>
+        <w:t>typeof</w:t>
+      </w:r>
+      <w:proofErr w:type="spellEnd"/>
+      <w:r>
+        <w:rPr>
+          <w:rFonts w:ascii="Times New Roman" w:hAnsi="Times New Roman" w:cs="Times New Roman"/>
+          <w:sz w:val="24"/>
+          <w:szCs w:val="24"/>
+          <w:lang w:val="en-ID"/>
+        </w:rPr>
+        <w:t xml:space="preserve"> </w:t>
+      </w:r>
+      <w:proofErr w:type="spellStart"/>
+      <w:r>
+        <w:rPr>
+          <w:rFonts w:ascii="Times New Roman" w:hAnsi="Times New Roman" w:cs="Times New Roman"/>
+          <w:sz w:val="24"/>
+          <w:szCs w:val="24"/>
+          <w:lang w:val="en-ID"/>
+        </w:rPr>
+        <w:t>pdfParse</w:t>
+      </w:r>
+      <w:proofErr w:type="spellEnd"/>
+      <w:r>
+        <w:rPr>
+          <w:rFonts w:ascii="Times New Roman" w:hAnsi="Times New Roman" w:cs="Times New Roman"/>
+          <w:sz w:val="24"/>
+          <w:szCs w:val="24"/>
+          <w:lang w:val="en-ID"/>
+        </w:rPr>
+        <w:t>):</w:t>
+      </w:r>
+    </w:p>
+    <w:p>
+      <w:pPr>
+        <w:spacing w:line="360" w:lineRule="auto"/>
+        <w:jc w:val="both"/>
+        <w:rPr>
+          <w:rFonts w:ascii="Times New Roman" w:hAnsi="Times New Roman" w:cs="Times New Roman"/>
+          <w:sz w:val="24"/>
+          <w:szCs w:val="24"/>
+          <w:lang w:val="sv-SE"/>
+        </w:rPr>
+      </w:pPr>
+      <w:proofErr w:type="spellStart"/>
+      <w:r>
+        <w:rPr>
+          <w:rFonts w:ascii="Times New Roman" w:hAnsi="Times New Roman" w:cs="Times New Roman"/>
+          <w:sz w:val="24"/>
+          <w:szCs w:val="24"/>
+          <w:lang w:val="en-ID"/>
+        </w:rPr>
+        <w:t>Kemarin</w:t>
+      </w:r>
+      <w:proofErr w:type="spellEnd"/>
+      <w:r>
+        <w:rPr>
+          <w:rFonts w:ascii="Times New Roman" w:hAnsi="Times New Roman" w:cs="Times New Roman"/>
+          <w:sz w:val="24"/>
+          <w:szCs w:val="24"/>
+          <w:lang w:val="en-ID"/>
+        </w:rPr>
+        <w:t xml:space="preserve"> </w:t>
+      </w:r>
+      <w:proofErr w:type="spellStart"/>
+      <w:r>
+        <w:rPr>
+          <w:rFonts w:ascii="Times New Roman" w:hAnsi="Times New Roman" w:cs="Times New Roman"/>
+          <w:sz w:val="24"/>
+          <w:szCs w:val="24"/>
+          <w:lang w:val="en-ID"/>
+        </w:rPr>
+        <w:t>kan</w:t>
+      </w:r>
+      <w:proofErr w:type="spellEnd"/>
+      <w:r>
+        <w:rPr>
+          <w:rFonts w:ascii="Times New Roman" w:hAnsi="Times New Roman" w:cs="Times New Roman"/>
+          <w:sz w:val="24"/>
+          <w:szCs w:val="24"/>
+          <w:lang w:val="en-ID"/>
+        </w:rPr>
+        <w:t xml:space="preserve"> </w:t>
+      </w:r>
+      <w:proofErr w:type="spellStart"/>
+      <w:r>
+        <w:rPr>
+          <w:rFonts w:ascii="Times New Roman" w:hAnsi="Times New Roman" w:cs="Times New Roman"/>
+          <w:sz w:val="24"/>
+          <w:szCs w:val="24"/>
+          <w:lang w:val="en-ID"/>
+        </w:rPr>
+        <w:t>terminalmu</w:t>
+      </w:r>
+      <w:proofErr w:type="spellEnd"/>
+      <w:r>
+        <w:rPr>
+          <w:rFonts w:ascii="Times New Roman" w:hAnsi="Times New Roman" w:cs="Times New Roman"/>
+          <w:sz w:val="24"/>
+          <w:szCs w:val="24"/>
+          <w:lang w:val="en-ID"/>
+        </w:rPr>
+        <w:t xml:space="preserve"> </w:t>
+      </w:r>
+      <w:proofErr w:type="spellStart"/>
+      <w:r>
+        <w:rPr>
+          <w:rFonts w:ascii="Times New Roman" w:hAnsi="Times New Roman" w:cs="Times New Roman"/>
+          <w:sz w:val="24"/>
+          <w:szCs w:val="24"/>
+          <w:lang w:val="en-ID"/>
+        </w:rPr>
+        <w:t>sempat</w:t>
+      </w:r>
+      <w:proofErr w:type="spellEnd"/>
+      <w:r>
+        <w:rPr>
+          <w:rFonts w:ascii="Times New Roman" w:hAnsi="Times New Roman" w:cs="Times New Roman"/>
+          <w:sz w:val="24"/>
+          <w:szCs w:val="24"/>
+          <w:lang w:val="en-ID"/>
+        </w:rPr>
+        <w:t xml:space="preserve"> </w:t>
+      </w:r>
+      <w:proofErr w:type="spellStart"/>
+      <w:r>
+        <w:rPr>
+          <w:rFonts w:ascii="Times New Roman" w:hAnsi="Times New Roman" w:cs="Times New Roman"/>
+          <w:sz w:val="24"/>
+          <w:szCs w:val="24"/>
+          <w:lang w:val="en-ID"/>
+        </w:rPr>
+        <w:t>ngamuk</w:t>
+      </w:r>
+      <w:proofErr w:type="spellEnd"/>
+      <w:r>
+        <w:rPr>
+          <w:rFonts w:ascii="Times New Roman" w:hAnsi="Times New Roman" w:cs="Times New Roman"/>
+          <w:sz w:val="24"/>
+          <w:szCs w:val="24"/>
+          <w:lang w:val="en-ID"/>
+        </w:rPr>
+        <w:t xml:space="preserve"> </w:t>
+      </w:r>
+      <w:proofErr w:type="spellStart"/>
+      <w:r>
+        <w:rPr>
+          <w:rFonts w:ascii="Times New Roman" w:hAnsi="Times New Roman" w:cs="Times New Roman"/>
+          <w:sz w:val="24"/>
+          <w:szCs w:val="24"/>
+          <w:lang w:val="en-ID"/>
+        </w:rPr>
+        <w:t>ngeluarin</w:t>
+      </w:r>
+      <w:proofErr w:type="spellEnd"/>
+      <w:r>
+        <w:rPr>
+          <w:rFonts w:ascii="Times New Roman" w:hAnsi="Times New Roman" w:cs="Times New Roman"/>
+          <w:sz w:val="24"/>
+          <w:szCs w:val="24"/>
+          <w:lang w:val="en-ID"/>
+        </w:rPr>
+        <w:t xml:space="preserve"> tulisan pdf is not a function. Itu </w:t>
+      </w:r>
+      <w:proofErr w:type="spellStart"/>
+      <w:r>
+        <w:rPr>
+          <w:rFonts w:ascii="Times New Roman" w:hAnsi="Times New Roman" w:cs="Times New Roman"/>
+          <w:sz w:val="24"/>
+          <w:szCs w:val="24"/>
+          <w:lang w:val="en-ID"/>
+        </w:rPr>
+        <w:t>kejadian</w:t>
+      </w:r>
+      <w:proofErr w:type="spellEnd"/>
+      <w:r>
+        <w:rPr>
+          <w:rFonts w:ascii="Times New Roman" w:hAnsi="Times New Roman" w:cs="Times New Roman"/>
+          <w:sz w:val="24"/>
+          <w:szCs w:val="24"/>
+          <w:lang w:val="en-ID"/>
+        </w:rPr>
+        <w:t xml:space="preserve"> </w:t>
+      </w:r>
+      <w:proofErr w:type="spellStart"/>
+      <w:r>
+        <w:rPr>
+          <w:rFonts w:ascii="Times New Roman" w:hAnsi="Times New Roman" w:cs="Times New Roman"/>
+          <w:sz w:val="24"/>
+          <w:szCs w:val="24"/>
+          <w:lang w:val="en-ID"/>
+        </w:rPr>
+        <w:t>karena</w:t>
+      </w:r>
+      <w:proofErr w:type="spellEnd"/>
+      <w:r>
+        <w:rPr>
+          <w:rFonts w:ascii="Times New Roman" w:hAnsi="Times New Roman" w:cs="Times New Roman"/>
+          <w:sz w:val="24"/>
+          <w:szCs w:val="24"/>
+          <w:lang w:val="en-ID"/>
+        </w:rPr>
+        <w:t xml:space="preserve"> </w:t>
+      </w:r>
+      <w:proofErr w:type="spellStart"/>
+      <w:r>
+        <w:rPr>
+          <w:rFonts w:ascii="Times New Roman" w:hAnsi="Times New Roman" w:cs="Times New Roman"/>
+          <w:sz w:val="24"/>
+          <w:szCs w:val="24"/>
+          <w:lang w:val="en-ID"/>
+        </w:rPr>
+        <w:t>kadang</w:t>
+      </w:r>
+      <w:proofErr w:type="spellEnd"/>
+      <w:r>
+        <w:rPr>
+          <w:rFonts w:ascii="Times New Roman" w:hAnsi="Times New Roman" w:cs="Times New Roman"/>
+          <w:sz w:val="24"/>
+          <w:szCs w:val="24"/>
+          <w:lang w:val="en-ID"/>
+        </w:rPr>
+        <w:t xml:space="preserve"> Node.js </w:t>
+      </w:r>
+      <w:proofErr w:type="spellStart"/>
+      <w:r>
+        <w:rPr>
+          <w:rFonts w:ascii="Times New Roman" w:hAnsi="Times New Roman" w:cs="Times New Roman"/>
+          <w:sz w:val="24"/>
+          <w:szCs w:val="24"/>
+          <w:lang w:val="en-ID"/>
+        </w:rPr>
+        <w:t>nangkep</w:t>
+      </w:r>
+      <w:proofErr w:type="spellEnd"/>
+      <w:r>
+        <w:rPr>
+          <w:rFonts w:ascii="Times New Roman" w:hAnsi="Times New Roman" w:cs="Times New Roman"/>
+          <w:sz w:val="24"/>
+          <w:szCs w:val="24"/>
+          <w:lang w:val="en-ID"/>
+        </w:rPr>
+        <w:t xml:space="preserve"> </w:t>
+      </w:r>
+      <w:proofErr w:type="spellStart"/>
+      <w:r>
+        <w:rPr>
+          <w:rFonts w:ascii="Times New Roman" w:hAnsi="Times New Roman" w:cs="Times New Roman"/>
+          <w:sz w:val="24"/>
+          <w:szCs w:val="24"/>
+          <w:lang w:val="en-ID"/>
+        </w:rPr>
+        <w:t>alat</w:t>
+      </w:r>
+      <w:proofErr w:type="spellEnd"/>
+      <w:r>
+        <w:rPr>
+          <w:rFonts w:ascii="Times New Roman" w:hAnsi="Times New Roman" w:cs="Times New Roman"/>
+          <w:sz w:val="24"/>
+          <w:szCs w:val="24"/>
+          <w:lang w:val="en-ID"/>
+        </w:rPr>
+        <w:t xml:space="preserve"> </w:t>
+      </w:r>
+      <w:proofErr w:type="spellStart"/>
+      <w:r>
+        <w:rPr>
+          <w:rFonts w:ascii="Times New Roman" w:hAnsi="Times New Roman" w:cs="Times New Roman"/>
+          <w:sz w:val="24"/>
+          <w:szCs w:val="24"/>
+          <w:lang w:val="en-ID"/>
+        </w:rPr>
+        <w:t>bantu</w:t>
+      </w:r>
+      <w:proofErr w:type="spellEnd"/>
+      <w:r>
+        <w:rPr>
+          <w:rFonts w:ascii="Times New Roman" w:hAnsi="Times New Roman" w:cs="Times New Roman"/>
+          <w:sz w:val="24"/>
+          <w:szCs w:val="24"/>
+          <w:lang w:val="en-ID"/>
+        </w:rPr>
+        <w:t xml:space="preserve"> </w:t>
+      </w:r>
+      <w:proofErr w:type="spellStart"/>
+      <w:r>
+        <w:rPr>
+          <w:rFonts w:ascii="Times New Roman" w:hAnsi="Times New Roman" w:cs="Times New Roman"/>
+          <w:sz w:val="24"/>
+          <w:szCs w:val="24"/>
+          <w:lang w:val="en-ID"/>
+        </w:rPr>
+        <w:t>dari</w:t>
+      </w:r>
+      <w:proofErr w:type="spellEnd"/>
+      <w:r>
+        <w:rPr>
+          <w:rFonts w:ascii="Times New Roman" w:hAnsi="Times New Roman" w:cs="Times New Roman"/>
+          <w:sz w:val="24"/>
+          <w:szCs w:val="24"/>
+          <w:lang w:val="en-ID"/>
+        </w:rPr>
+        <w:t xml:space="preserve"> </w:t>
+      </w:r>
+      <w:proofErr w:type="spellStart"/>
+      <w:r>
+        <w:rPr>
+          <w:rFonts w:ascii="Times New Roman" w:hAnsi="Times New Roman" w:cs="Times New Roman"/>
+          <w:sz w:val="24"/>
+          <w:szCs w:val="24"/>
+          <w:lang w:val="en-ID"/>
+        </w:rPr>
+        <w:t>luar</w:t>
+      </w:r>
+      <w:proofErr w:type="spellEnd"/>
+      <w:r>
+        <w:rPr>
+          <w:rFonts w:ascii="Times New Roman" w:hAnsi="Times New Roman" w:cs="Times New Roman"/>
+          <w:sz w:val="24"/>
+          <w:szCs w:val="24"/>
+          <w:lang w:val="en-ID"/>
+        </w:rPr>
+        <w:t xml:space="preserve"> (kayak pdf-parse) </w:t>
+      </w:r>
+      <w:proofErr w:type="spellStart"/>
+      <w:r>
+        <w:rPr>
+          <w:rFonts w:ascii="Times New Roman" w:hAnsi="Times New Roman" w:cs="Times New Roman"/>
+          <w:sz w:val="24"/>
+          <w:szCs w:val="24"/>
+          <w:lang w:val="en-ID"/>
+        </w:rPr>
+        <w:t>sebagai</w:t>
+      </w:r>
+      <w:proofErr w:type="spellEnd"/>
+      <w:r>
+        <w:rPr>
+          <w:rFonts w:ascii="Times New Roman" w:hAnsi="Times New Roman" w:cs="Times New Roman"/>
+          <w:sz w:val="24"/>
+          <w:szCs w:val="24"/>
+          <w:lang w:val="en-ID"/>
+        </w:rPr>
+        <w:t xml:space="preserve"> "</w:t>
+      </w:r>
+      <w:proofErr w:type="spellStart"/>
+      <w:r>
+        <w:rPr>
+          <w:rFonts w:ascii="Times New Roman" w:hAnsi="Times New Roman" w:cs="Times New Roman"/>
+          <w:sz w:val="24"/>
+          <w:szCs w:val="24"/>
+          <w:lang w:val="en-ID"/>
+        </w:rPr>
+        <w:t>kardus</w:t>
+      </w:r>
+      <w:proofErr w:type="spellEnd"/>
+      <w:r>
+        <w:rPr>
+          <w:rFonts w:ascii="Times New Roman" w:hAnsi="Times New Roman" w:cs="Times New Roman"/>
+          <w:sz w:val="24"/>
+          <w:szCs w:val="24"/>
+          <w:lang w:val="en-ID"/>
+        </w:rPr>
+        <w:t xml:space="preserve"> </w:t>
+      </w:r>
+      <w:proofErr w:type="spellStart"/>
+      <w:r>
+        <w:rPr>
+          <w:rFonts w:ascii="Times New Roman" w:hAnsi="Times New Roman" w:cs="Times New Roman"/>
+          <w:sz w:val="24"/>
+          <w:szCs w:val="24"/>
+          <w:lang w:val="en-ID"/>
+        </w:rPr>
+        <w:t>bungkusan</w:t>
+      </w:r>
+      <w:proofErr w:type="spellEnd"/>
+      <w:r>
+        <w:rPr>
+          <w:rFonts w:ascii="Times New Roman" w:hAnsi="Times New Roman" w:cs="Times New Roman"/>
+          <w:sz w:val="24"/>
+          <w:szCs w:val="24"/>
+          <w:lang w:val="en-ID"/>
+        </w:rPr>
+        <w:t xml:space="preserve">", </w:t>
+      </w:r>
+      <w:proofErr w:type="spellStart"/>
+      <w:r>
+        <w:rPr>
+          <w:rFonts w:ascii="Times New Roman" w:hAnsi="Times New Roman" w:cs="Times New Roman"/>
+          <w:sz w:val="24"/>
+          <w:szCs w:val="24"/>
+          <w:lang w:val="en-ID"/>
+        </w:rPr>
+        <w:t>bukan</w:t>
+      </w:r>
+      <w:proofErr w:type="spellEnd"/>
+      <w:r>
+        <w:rPr>
+          <w:rFonts w:ascii="Times New Roman" w:hAnsi="Times New Roman" w:cs="Times New Roman"/>
+          <w:sz w:val="24"/>
+          <w:szCs w:val="24"/>
+          <w:lang w:val="en-ID"/>
+        </w:rPr>
+        <w:t xml:space="preserve"> </w:t>
+      </w:r>
+      <w:proofErr w:type="spellStart"/>
+      <w:r>
+        <w:rPr>
+          <w:rFonts w:ascii="Times New Roman" w:hAnsi="Times New Roman" w:cs="Times New Roman"/>
+          <w:sz w:val="24"/>
+          <w:szCs w:val="24"/>
+          <w:lang w:val="en-ID"/>
+        </w:rPr>
+        <w:t>sebagai</w:t>
+      </w:r>
+      <w:proofErr w:type="spellEnd"/>
+      <w:r>
+        <w:rPr>
+          <w:rFonts w:ascii="Times New Roman" w:hAnsi="Times New Roman" w:cs="Times New Roman"/>
+          <w:sz w:val="24"/>
+          <w:szCs w:val="24"/>
+          <w:lang w:val="en-ID"/>
+        </w:rPr>
+        <w:t xml:space="preserve"> </w:t>
+      </w:r>
+      <w:proofErr w:type="spellStart"/>
+      <w:r>
+        <w:rPr>
+          <w:rFonts w:ascii="Times New Roman" w:hAnsi="Times New Roman" w:cs="Times New Roman"/>
+          <w:sz w:val="24"/>
+          <w:szCs w:val="24"/>
+          <w:lang w:val="en-ID"/>
+        </w:rPr>
+        <w:t>alat</w:t>
+      </w:r>
+      <w:proofErr w:type="spellEnd"/>
+      <w:r>
+        <w:rPr>
+          <w:rFonts w:ascii="Times New Roman" w:hAnsi="Times New Roman" w:cs="Times New Roman"/>
+          <w:sz w:val="24"/>
+          <w:szCs w:val="24"/>
+          <w:lang w:val="en-ID"/>
+        </w:rPr>
+        <w:t xml:space="preserve"> yang </w:t>
+      </w:r>
+      <w:proofErr w:type="spellStart"/>
+      <w:r>
+        <w:rPr>
+          <w:rFonts w:ascii="Times New Roman" w:hAnsi="Times New Roman" w:cs="Times New Roman"/>
+          <w:sz w:val="24"/>
+          <w:szCs w:val="24"/>
+          <w:lang w:val="en-ID"/>
+        </w:rPr>
+        <w:t>bisa</w:t>
+      </w:r>
+      <w:proofErr w:type="spellEnd"/>
+      <w:r>
+        <w:rPr>
+          <w:rFonts w:ascii="Times New Roman" w:hAnsi="Times New Roman" w:cs="Times New Roman"/>
+          <w:sz w:val="24"/>
+          <w:szCs w:val="24"/>
+          <w:lang w:val="en-ID"/>
+        </w:rPr>
+        <w:t xml:space="preserve"> </w:t>
+      </w:r>
+      <w:proofErr w:type="spellStart"/>
+      <w:r>
+        <w:rPr>
+          <w:rFonts w:ascii="Times New Roman" w:hAnsi="Times New Roman" w:cs="Times New Roman"/>
+          <w:sz w:val="24"/>
+          <w:szCs w:val="24"/>
+          <w:lang w:val="en-ID"/>
+        </w:rPr>
+        <w:t>langsung</w:t>
+      </w:r>
+      <w:proofErr w:type="spellEnd"/>
+      <w:r>
+        <w:rPr>
+          <w:rFonts w:ascii="Times New Roman" w:hAnsi="Times New Roman" w:cs="Times New Roman"/>
+          <w:sz w:val="24"/>
+          <w:szCs w:val="24"/>
+          <w:lang w:val="en-ID"/>
+        </w:rPr>
+        <w:t xml:space="preserve"> </w:t>
+      </w:r>
+      <w:proofErr w:type="spellStart"/>
+      <w:r>
+        <w:rPr>
+          <w:rFonts w:ascii="Times New Roman" w:hAnsi="Times New Roman" w:cs="Times New Roman"/>
+          <w:sz w:val="24"/>
+          <w:szCs w:val="24"/>
+          <w:lang w:val="en-ID"/>
+        </w:rPr>
+        <w:t>dipakai</w:t>
+      </w:r>
+      <w:proofErr w:type="spellEnd"/>
+      <w:r>
+        <w:rPr>
+          <w:rFonts w:ascii="Times New Roman" w:hAnsi="Times New Roman" w:cs="Times New Roman"/>
+          <w:sz w:val="24"/>
+          <w:szCs w:val="24"/>
+          <w:lang w:val="en-ID"/>
+        </w:rPr>
+        <w:t xml:space="preserve">. </w:t>
+      </w:r>
+      <w:r>
+        <w:rPr>
+          <w:rFonts w:ascii="Times New Roman" w:hAnsi="Times New Roman" w:cs="Times New Roman"/>
+          <w:sz w:val="24"/>
+          <w:szCs w:val="24"/>
+          <w:lang w:val="sv-SE"/>
+        </w:rPr>
+        <w:t>Nah, di kode yang baru, kita kasih logika pintar: "Coba cek, kalau ini alat, langsung pakai. Kalau ini kardus, buka dulu kardusnya (pakai .default), baru pakai alat di dalamnya."</w:t>
+      </w:r>
+    </w:p>
+    <w:p>
+      <w:pPr>
+        <w:spacing w:line="360" w:lineRule="auto"/>
+        <w:jc w:val="both"/>
+        <w:rPr>
+          <w:rFonts w:ascii="Times New Roman" w:hAnsi="Times New Roman" w:cs="Times New Roman"/>
+          <w:sz w:val="24"/>
+          <w:szCs w:val="24"/>
+          <w:lang w:val="sv-SE"/>
+        </w:rPr>
+      </w:pPr>
+    </w:p>
+    <w:p>
+      <w:pPr>
+        <w:spacing w:line="360" w:lineRule="auto"/>
+        <w:jc w:val="both"/>
+        <w:rPr>
+          <w:rFonts w:ascii="Times New Roman" w:hAnsi="Times New Roman" w:cs="Times New Roman"/>
+          <w:sz w:val="24"/>
+          <w:szCs w:val="24"/>
+          <w:lang w:val="sv-SE"/>
+        </w:rPr>
+      </w:pPr>
+      <w:r>
+        <w:rPr>
+          <w:rFonts w:ascii="Times New Roman" w:hAnsi="Times New Roman" w:cs="Times New Roman"/>
+          <w:sz w:val="24"/>
+          <w:szCs w:val="24"/>
+          <w:lang w:val="sv-SE"/>
+        </w:rPr>
+        <w:t>Pembatasan Format:</w:t>
+      </w:r>
+    </w:p>
+    <w:p>
+      <w:pPr>
+        <w:spacing w:line="360" w:lineRule="auto"/>
+        <w:jc w:val="both"/>
+        <w:rPr>
+          <w:rFonts w:ascii="Times New Roman" w:hAnsi="Times New Roman" w:cs="Times New Roman"/>
+          <w:sz w:val="24"/>
+          <w:szCs w:val="24"/>
+          <w:lang w:val="sv-SE"/>
+        </w:rPr>
+      </w:pPr>
+      <w:r>
+        <w:rPr>
+          <w:rFonts w:ascii="Times New Roman" w:hAnsi="Times New Roman" w:cs="Times New Roman"/>
+          <w:sz w:val="24"/>
+          <w:szCs w:val="24"/>
+          <w:lang w:val="sv-SE"/>
+        </w:rPr>
+        <w:t>Kita sepakat membatasi mesin ini buat baca PDF dan Word (.docx) aja (menggunakan alat bernama mammoth). Kalau dipaksa nerima PPT, servernya bakal kebingungan dan malah mati (error 500). Makanya kita pasang sistem tolak otomatis buat format lain.</w:t>
+      </w:r>
+    </w:p>
+    <w:p>
+      <w:pPr>
+        <w:spacing w:line="360" w:lineRule="auto"/>
+        <w:jc w:val="both"/>
+        <w:rPr>
+          <w:rFonts w:ascii="Times New Roman" w:hAnsi="Times New Roman" w:cs="Times New Roman"/>
+          <w:sz w:val="24"/>
+          <w:szCs w:val="24"/>
+          <w:lang w:val="sv-SE"/>
+        </w:rPr>
+      </w:pPr>
+    </w:p>
+    <w:p>
+      <w:pPr>
+        <w:spacing w:line="360" w:lineRule="auto"/>
+        <w:jc w:val="both"/>
+        <w:rPr>
+          <w:rFonts w:ascii="Times New Roman" w:hAnsi="Times New Roman" w:cs="Times New Roman"/>
+          <w:sz w:val="24"/>
+          <w:szCs w:val="24"/>
+          <w:lang w:val="sv-SE"/>
+        </w:rPr>
+      </w:pPr>
+      <w:r>
+        <w:rPr>
+          <w:rFonts w:ascii="Times New Roman" w:hAnsi="Times New Roman" w:cs="Times New Roman"/>
+          <w:sz w:val="24"/>
+          <w:szCs w:val="24"/>
+          <w:lang w:val="sv-SE"/>
+        </w:rPr>
+        <w:t>2. Bagian Frontend: Halaman Upload (UploadPage.jsx &amp; .css)</w:t>
+      </w:r>
+    </w:p>
+    <w:p>
+      <w:pPr>
+        <w:spacing w:line="360" w:lineRule="auto"/>
+        <w:jc w:val="both"/>
+        <w:rPr>
+          <w:rFonts w:ascii="Times New Roman" w:hAnsi="Times New Roman" w:cs="Times New Roman"/>
+          <w:sz w:val="24"/>
+          <w:szCs w:val="24"/>
+          <w:lang w:val="sv-SE"/>
+        </w:rPr>
+      </w:pPr>
+      <w:r>
+        <w:rPr>
+          <w:rFonts w:ascii="Times New Roman" w:hAnsi="Times New Roman" w:cs="Times New Roman"/>
+          <w:sz w:val="24"/>
+          <w:szCs w:val="24"/>
+          <w:lang w:val="sv-SE"/>
+        </w:rPr>
+        <w:t>Ini adalah gerbang depan tempat user masukin file materi.</w:t>
+      </w:r>
+    </w:p>
+    <w:p>
+      <w:pPr>
+        <w:spacing w:line="360" w:lineRule="auto"/>
+        <w:jc w:val="both"/>
+        <w:rPr>
+          <w:rFonts w:ascii="Times New Roman" w:hAnsi="Times New Roman" w:cs="Times New Roman"/>
+          <w:sz w:val="24"/>
+          <w:szCs w:val="24"/>
+          <w:lang w:val="sv-SE"/>
+        </w:rPr>
+      </w:pPr>
+    </w:p>
+    <w:p>
+      <w:pPr>
+        <w:spacing w:line="360" w:lineRule="auto"/>
+        <w:jc w:val="both"/>
+        <w:rPr>
+          <w:rFonts w:ascii="Times New Roman" w:hAnsi="Times New Roman" w:cs="Times New Roman"/>
+          <w:sz w:val="24"/>
+          <w:szCs w:val="24"/>
+          <w:lang w:val="sv-SE"/>
+        </w:rPr>
+      </w:pPr>
+      <w:r>
+        <w:rPr>
+          <w:rFonts w:ascii="Times New Roman" w:hAnsi="Times New Roman" w:cs="Times New Roman"/>
+          <w:sz w:val="24"/>
+          <w:szCs w:val="24"/>
+          <w:lang w:val="sv-SE"/>
+        </w:rPr>
+        <w:t>Pemisahan Otak dan Baju:</w:t>
+      </w:r>
+    </w:p>
+    <w:p>
+      <w:pPr>
+        <w:spacing w:line="360" w:lineRule="auto"/>
+        <w:jc w:val="both"/>
+        <w:rPr>
+          <w:rFonts w:ascii="Times New Roman" w:hAnsi="Times New Roman" w:cs="Times New Roman"/>
+          <w:sz w:val="24"/>
+          <w:szCs w:val="24"/>
+          <w:lang w:val="sv-SE"/>
+        </w:rPr>
+      </w:pPr>
+      <w:r>
+        <w:rPr>
+          <w:rFonts w:ascii="Times New Roman" w:hAnsi="Times New Roman" w:cs="Times New Roman"/>
+          <w:sz w:val="24"/>
+          <w:szCs w:val="24"/>
+          <w:lang w:val="sv-SE"/>
+        </w:rPr>
+        <w:t>Sebelumnya, logika upload file dan desain warna-warni digabung di satu tempat pakai style={{ ... }}. Itu bahaya banget, karena salah ngetik koma di desain bisa bikin logika upload-nya rusak. Sekarang, otaknya murni di .jsx dan bajunya khusus di .css. Kodingan jadi jauh lebih tipis dan gampang dibaca.</w:t>
+      </w:r>
+    </w:p>
+    <w:p>
+      <w:pPr>
+        <w:spacing w:line="360" w:lineRule="auto"/>
+        <w:jc w:val="both"/>
+        <w:rPr>
+          <w:rFonts w:ascii="Times New Roman" w:hAnsi="Times New Roman" w:cs="Times New Roman"/>
+          <w:sz w:val="24"/>
+          <w:szCs w:val="24"/>
+          <w:lang w:val="sv-SE"/>
+        </w:rPr>
+      </w:pPr>
+    </w:p>
+    <w:p>
+      <w:pPr>
+        <w:spacing w:line="360" w:lineRule="auto"/>
+        <w:jc w:val="both"/>
+        <w:rPr>
+          <w:rFonts w:ascii="Times New Roman" w:hAnsi="Times New Roman" w:cs="Times New Roman"/>
+          <w:sz w:val="24"/>
+          <w:szCs w:val="24"/>
+          <w:lang w:val="sv-SE"/>
+        </w:rPr>
+      </w:pPr>
+      <w:r>
+        <w:rPr>
+          <w:rFonts w:ascii="Times New Roman" w:hAnsi="Times New Roman" w:cs="Times New Roman"/>
+          <w:sz w:val="24"/>
+          <w:szCs w:val="24"/>
+          <w:lang w:val="sv-SE"/>
+        </w:rPr>
+        <w:t>Mencegah Orang Ngirim PPT (useDropzone):</w:t>
+      </w:r>
+    </w:p>
+    <w:p>
+      <w:pPr>
+        <w:spacing w:line="360" w:lineRule="auto"/>
+        <w:jc w:val="both"/>
+        <w:rPr>
+          <w:rFonts w:ascii="Times New Roman" w:hAnsi="Times New Roman" w:cs="Times New Roman"/>
+          <w:sz w:val="24"/>
+          <w:szCs w:val="24"/>
+          <w:lang w:val="sv-SE"/>
+        </w:rPr>
+      </w:pPr>
+      <w:r>
+        <w:rPr>
+          <w:rFonts w:ascii="Times New Roman" w:hAnsi="Times New Roman" w:cs="Times New Roman"/>
+          <w:sz w:val="24"/>
+          <w:szCs w:val="24"/>
+          <w:lang w:val="sv-SE"/>
+        </w:rPr>
+        <w:t>Karena backend kita tadi cuma sanggup baca PDF dan DOCX, maka pintu masuk di frontend juga harus dijaga. Di bagian accept, kita setel biar kotak upload-nya secara otomatis menolak kalau ada user yang nyoba masukin PPT atau format aneh lainnya. Ini bikin frontend dan backend kerjanya sinkron.</w:t>
+      </w:r>
+    </w:p>
+    <w:p>
+      <w:pPr>
+        <w:spacing w:line="360" w:lineRule="auto"/>
+        <w:jc w:val="both"/>
+        <w:rPr>
+          <w:rFonts w:ascii="Times New Roman" w:hAnsi="Times New Roman" w:cs="Times New Roman"/>
+          <w:sz w:val="24"/>
+          <w:szCs w:val="24"/>
+          <w:lang w:val="sv-SE"/>
+        </w:rPr>
+      </w:pPr>
+    </w:p>
+    <w:p>
+      <w:pPr>
+        <w:spacing w:line="360" w:lineRule="auto"/>
+        <w:jc w:val="both"/>
+        <w:rPr>
+          <w:rFonts w:ascii="Times New Roman" w:hAnsi="Times New Roman" w:cs="Times New Roman"/>
+          <w:sz w:val="24"/>
+          <w:szCs w:val="24"/>
+          <w:lang w:val="sv-SE"/>
+        </w:rPr>
+      </w:pPr>
+      <w:r>
+        <w:rPr>
+          <w:rFonts w:ascii="Times New Roman" w:hAnsi="Times New Roman" w:cs="Times New Roman"/>
+          <w:sz w:val="24"/>
+          <w:szCs w:val="24"/>
+          <w:lang w:val="sv-SE"/>
+        </w:rPr>
+        <w:t>3. Bagian Frontend: Arena Kuis (QuizPage.jsx &amp; .css)</w:t>
+      </w:r>
+    </w:p>
+    <w:p>
+      <w:pPr>
+        <w:spacing w:line="360" w:lineRule="auto"/>
+        <w:jc w:val="both"/>
+        <w:rPr>
+          <w:rFonts w:ascii="Times New Roman" w:hAnsi="Times New Roman" w:cs="Times New Roman"/>
+          <w:sz w:val="24"/>
+          <w:szCs w:val="24"/>
+          <w:lang w:val="sv-SE"/>
+        </w:rPr>
+      </w:pPr>
+      <w:r>
+        <w:rPr>
+          <w:rFonts w:ascii="Times New Roman" w:hAnsi="Times New Roman" w:cs="Times New Roman"/>
+          <w:sz w:val="24"/>
+          <w:szCs w:val="24"/>
+          <w:lang w:val="sv-SE"/>
+        </w:rPr>
+        <w:t>Ini halaman paling krusial tempat game-nya berjalan, yang tadi masalahnya teks kuisnya nyaru (putih di atas putih).</w:t>
+      </w:r>
+    </w:p>
+    <w:p>
+      <w:pPr>
+        <w:spacing w:line="360" w:lineRule="auto"/>
+        <w:jc w:val="both"/>
+        <w:rPr>
+          <w:rFonts w:ascii="Times New Roman" w:hAnsi="Times New Roman" w:cs="Times New Roman"/>
+          <w:sz w:val="24"/>
+          <w:szCs w:val="24"/>
+          <w:lang w:val="sv-SE"/>
+        </w:rPr>
+      </w:pPr>
+    </w:p>
+    <w:p>
+      <w:pPr>
+        <w:spacing w:line="360" w:lineRule="auto"/>
+        <w:jc w:val="both"/>
+        <w:rPr>
+          <w:rFonts w:ascii="Times New Roman" w:hAnsi="Times New Roman" w:cs="Times New Roman"/>
+          <w:sz w:val="24"/>
+          <w:szCs w:val="24"/>
+          <w:lang w:val="sv-SE"/>
+        </w:rPr>
+      </w:pPr>
+      <w:r>
+        <w:rPr>
+          <w:rFonts w:ascii="Times New Roman" w:hAnsi="Times New Roman" w:cs="Times New Roman"/>
+          <w:sz w:val="24"/>
+          <w:szCs w:val="24"/>
+          <w:lang w:val="sv-SE"/>
+        </w:rPr>
+        <w:t>Mengobati Teks Siluman:</w:t>
+      </w:r>
+    </w:p>
+    <w:p>
+      <w:pPr>
+        <w:spacing w:line="360" w:lineRule="auto"/>
+        <w:jc w:val="both"/>
+        <w:rPr>
+          <w:rFonts w:ascii="Times New Roman" w:hAnsi="Times New Roman" w:cs="Times New Roman"/>
+          <w:sz w:val="24"/>
+          <w:szCs w:val="24"/>
+          <w:lang w:val="sv-SE"/>
+        </w:rPr>
+      </w:pPr>
+      <w:r>
+        <w:rPr>
+          <w:rFonts w:ascii="Times New Roman" w:hAnsi="Times New Roman" w:cs="Times New Roman"/>
+          <w:sz w:val="24"/>
+          <w:szCs w:val="24"/>
+          <w:lang w:val="sv-SE"/>
+        </w:rPr>
+        <w:t>Di file QuizPage.css, kita kasih aturan tegas ke pembungkus teks soal (.question-text) dan teks pilihan ganda (.option-button) dengan properti color: #1a1a1a;. Itu kode warna untuk hitam keabu-abuan. Jadi teksnya langsung nempel jelas di atas kotak kuis yang warnanya putih.</w:t>
+      </w:r>
+    </w:p>
+    <w:p>
+      <w:pPr>
+        <w:spacing w:line="360" w:lineRule="auto"/>
+        <w:jc w:val="both"/>
+        <w:rPr>
+          <w:rFonts w:ascii="Times New Roman" w:hAnsi="Times New Roman" w:cs="Times New Roman"/>
+          <w:sz w:val="24"/>
+          <w:szCs w:val="24"/>
+          <w:lang w:val="sv-SE"/>
+        </w:rPr>
+      </w:pPr>
+    </w:p>
+    <w:p>
+      <w:pPr>
+        <w:spacing w:line="360" w:lineRule="auto"/>
+        <w:jc w:val="both"/>
+        <w:rPr>
+          <w:rFonts w:ascii="Times New Roman" w:hAnsi="Times New Roman" w:cs="Times New Roman"/>
+          <w:sz w:val="24"/>
+          <w:szCs w:val="24"/>
+          <w:lang w:val="sv-SE"/>
+        </w:rPr>
+      </w:pPr>
+      <w:r>
+        <w:rPr>
+          <w:rFonts w:ascii="Times New Roman" w:hAnsi="Times New Roman" w:cs="Times New Roman"/>
+          <w:sz w:val="24"/>
+          <w:szCs w:val="24"/>
+          <w:lang w:val="sv-SE"/>
+        </w:rPr>
+        <w:t>Bikin Efek Tombol Lebih Enteng (:hover):</w:t>
+      </w:r>
+    </w:p>
+    <w:p>
+      <w:pPr>
+        <w:spacing w:line="360" w:lineRule="auto"/>
+        <w:jc w:val="both"/>
+        <w:rPr>
+          <w:rFonts w:ascii="Times New Roman" w:hAnsi="Times New Roman" w:cs="Times New Roman"/>
+          <w:sz w:val="24"/>
+          <w:szCs w:val="24"/>
+          <w:lang w:val="sv-SE"/>
+        </w:rPr>
+      </w:pPr>
+      <w:r>
+        <w:rPr>
+          <w:rFonts w:ascii="Times New Roman" w:hAnsi="Times New Roman" w:cs="Times New Roman"/>
+          <w:sz w:val="24"/>
+          <w:szCs w:val="24"/>
+          <w:lang w:val="sv-SE"/>
+        </w:rPr>
+        <w:lastRenderedPageBreak/>
+        <w:t>Di kodingan lamamu, pas mouse disorot ke pilihan ganda, tombolnya berubah warna pakai bantuan Javascript (onMouseOver dan onMouseOut). Cara itu ibaratnya nyuruh otak (JS) buat ngerjain tugas gampang, bikin web jadi berat. Sekarang, tugas itu kita serahin 100% ke penjahit baju (CSS) pakai efek .option-button:hover. Web kamu jadi kerasa jauh lebih ringan dan mulus pas diklik-klik.</w:t>
+      </w:r>
+    </w:p>
+    <w:p>
+      <w:pPr>
+        <w:spacing w:line="360" w:lineRule="auto"/>
+        <w:jc w:val="both"/>
+        <w:rPr>
+          <w:rFonts w:ascii="Times New Roman" w:hAnsi="Times New Roman" w:cs="Times New Roman"/>
+          <w:sz w:val="24"/>
+          <w:szCs w:val="24"/>
+          <w:lang w:val="sv-SE"/>
+        </w:rPr>
+      </w:pPr>
+    </w:p>
+    <w:p>
+      <w:pPr>
+        <w:spacing w:line="360" w:lineRule="auto"/>
+        <w:jc w:val="both"/>
+        <w:rPr>
+          <w:rFonts w:ascii="Times New Roman" w:hAnsi="Times New Roman" w:cs="Times New Roman"/>
+          <w:sz w:val="24"/>
+          <w:szCs w:val="24"/>
+          <w:lang w:val="sv-SE"/>
+        </w:rPr>
+      </w:pPr>
+      <w:r>
+        <w:rPr>
+          <w:rFonts w:ascii="Times New Roman" w:hAnsi="Times New Roman" w:cs="Times New Roman"/>
+          <w:sz w:val="24"/>
+          <w:szCs w:val="24"/>
+          <w:lang w:val="sv-SE"/>
+        </w:rPr>
+        <w:t>Logika Pindah Soal:</w:t>
+      </w:r>
+    </w:p>
+    <w:p>
+      <w:pPr>
+        <w:spacing w:line="360" w:lineRule="auto"/>
+        <w:jc w:val="both"/>
+        <w:rPr>
+          <w:rFonts w:ascii="Times New Roman" w:hAnsi="Times New Roman" w:cs="Times New Roman"/>
+          <w:sz w:val="24"/>
+          <w:szCs w:val="24"/>
+          <w:lang w:val="pt-BR"/>
+        </w:rPr>
+      </w:pPr>
+      <w:r>
+        <w:rPr>
+          <w:rFonts w:ascii="Times New Roman" w:hAnsi="Times New Roman" w:cs="Times New Roman"/>
+          <w:sz w:val="24"/>
+          <w:szCs w:val="24"/>
+          <w:lang w:val="sv-SE"/>
+        </w:rPr>
+        <w:t xml:space="preserve">Logika permainannya tetap sama dan aman: tiap kali tombol jawaban diklik, dia ngecek apakah ada soal berikutnya. </w:t>
+      </w:r>
+      <w:r>
+        <w:rPr>
+          <w:rFonts w:ascii="Times New Roman" w:hAnsi="Times New Roman" w:cs="Times New Roman"/>
+          <w:sz w:val="24"/>
+          <w:szCs w:val="24"/>
+          <w:lang w:val="pt-BR"/>
+        </w:rPr>
+        <w:t>Kalau ada, nomor soal (currentIndex) ditambah satu biar layarnya ganti pertanyaan. Kalau udah mentok, status permainannya diubah jadi "selesai" (isFinished = true) dan layarnya otomatis ganti ke halaman skor akhir.</w:t>
+      </w:r>
+    </w:p>
+    <w:p>
+      <w:pPr>
+        <w:spacing w:line="360" w:lineRule="auto"/>
+        <w:jc w:val="both"/>
+        <w:rPr>
+          <w:rFonts w:ascii="Times New Roman" w:hAnsi="Times New Roman" w:cs="Times New Roman"/>
+          <w:sz w:val="24"/>
+          <w:szCs w:val="24"/>
+          <w:lang w:val="pt-BR"/>
         </w:rPr>
       </w:pPr>
     </w:p>
@@ -4797,6 +5691,7 @@
   <w:style w:type="character" w:default="1" w:styleId="DefaultParagraphFont">
     <w:name w:val="Default Paragraph Font"/>
     <w:uiPriority w:val="1"/>
+    <w:semiHidden/>
     <w:unhideWhenUsed/>
   </w:style>
   <w:style w:type="table" w:default="1" w:styleId="TableNormal">

</xml_diff>